<commit_message>
Add cycle idle analysis and data QA notebooks; update TASKS.md and draft paper with results
- Introduced `cycle_idle_analysis.ipynb` for DBSCAN stop detection, cycle extraction, and fleet-wide inefficiency quantification.
- Added `data_qa.ipynb` for GPS pings cleaning, motion feature extraction, and zone polygon QA.
- Updated `TASKS.md` to reflect completed tasks in data engineering and methodology implementation.
- Revised draft paper to include findings from the analysis, detailing operational inefficiencies and recommendations for dispatch scheduling and zone coverage.
- Added new binary file for draft paper updates.
</commit_message>
<xml_diff>
--- a/paper/draft_paper.docx
+++ b/paper/draft_paper.docx
@@ -52,8 +52,13 @@
         <w:rPr>
           <w:noProof/>
         </w:rPr>
-        <w:pict w14:anchorId="1A88959F">
-          <v:rect id="_x0000_i1025" alt="" style="width:468pt;height:.05pt;mso-width-percent:0;mso-height-percent:0;mso-width-percent:0;mso-height-percent:0" o:hralign="center" o:hrstd="t" o:hr="t"/>
+      </w:r>
+      <w:r>
+        <w:pict w14:anchorId="474AF8A3">
+          <v:rect id="Horizontal Line 1" o:spid="_x0000_s1026" style="width:468pt;height:.05pt;visibility:visible;mso-wrap-style:square;mso-left-percent:-10001;mso-top-percent:-10001;mso-position-horizontal:absolute;mso-position-horizontal-relative:char;mso-position-vertical:absolute;mso-position-vertical-relative:line;mso-left-percent:-10001;mso-top-percent:-10001;v-text-anchor:top" o:gfxdata="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" filled="f">
+            <o:lock v:ext="edit" rotation="t" aspectratio="t" verticies="t" text="t" shapetype="t"/>
+            <w10:anchorlock/>
+          </v:rect>
         </w:pict>
       </w:r>
     </w:p>
@@ -713,6 +718,14 @@
       <w:tblPr>
         <w:tblStyle w:val="Table"/>
         <w:tblW w:w="5000" w:type="pct"/>
+        <w:tblBorders>
+          <w:top w:val="single" w:sz="4" w:space="0" w:color="auto"/>
+          <w:left w:val="single" w:sz="4" w:space="0" w:color="auto"/>
+          <w:bottom w:val="single" w:sz="4" w:space="0" w:color="auto"/>
+          <w:right w:val="single" w:sz="4" w:space="0" w:color="auto"/>
+          <w:insideH w:val="single" w:sz="4" w:space="0" w:color="auto"/>
+          <w:insideV w:val="single" w:sz="4" w:space="0" w:color="auto"/>
+        </w:tblBorders>
         <w:tblLook w:val="0020" w:firstRow="1" w:lastRow="0" w:firstColumn="0" w:lastColumn="0" w:noHBand="0" w:noVBand="0"/>
       </w:tblPr>
       <w:tblGrid>
@@ -727,6 +740,9 @@
         <w:tc>
           <w:tcPr>
             <w:tcW w:w="0" w:type="auto"/>
+            <w:tcBorders>
+              <w:bottom w:val="none" w:sz="0" w:space="0" w:color="auto"/>
+            </w:tcBorders>
           </w:tcPr>
           <w:p>
             <w:pPr>
@@ -740,6 +756,9 @@
         <w:tc>
           <w:tcPr>
             <w:tcW w:w="0" w:type="auto"/>
+            <w:tcBorders>
+              <w:bottom w:val="none" w:sz="0" w:space="0" w:color="auto"/>
+            </w:tcBorders>
           </w:tcPr>
           <w:p>
             <w:pPr>
@@ -753,6 +772,9 @@
         <w:tc>
           <w:tcPr>
             <w:tcW w:w="0" w:type="auto"/>
+            <w:tcBorders>
+              <w:bottom w:val="none" w:sz="0" w:space="0" w:color="auto"/>
+            </w:tcBorders>
           </w:tcPr>
           <w:p>
             <w:pPr>
@@ -1935,10 +1957,73 @@
         <w:t>Arabian Journal of Geosciences</w:t>
       </w:r>
       <w:r>
-        <w:t>, 14(11). https://doi.org/10.1007/s12517-021-07365-z</w:t>
-      </w:r>
+        <w:t xml:space="preserve">, 14(11). </w:t>
+      </w:r>
+      <w:hyperlink r:id="rId7" w:history="1">
+        <w:r>
+          <w:rPr>
+            <w:rStyle w:val="Hyperlink"/>
+          </w:rPr>
+          <w:t>https://doi.org/10.1007/s12517-021-07365-z</w:t>
+        </w:r>
+      </w:hyperlink>
       <w:bookmarkEnd w:id="0"/>
       <w:bookmarkEnd w:id="15"/>
+    </w:p>
+    <w:p>
+      <w:pPr>
+        <w:pStyle w:val="BodyText"/>
+      </w:pPr>
+    </w:p>
+    <w:p>
+      <w:pPr>
+        <w:pStyle w:val="BodyText"/>
+      </w:pPr>
+    </w:p>
+    <w:p>
+      <w:pPr>
+        <w:pStyle w:val="BodyText"/>
+        <w:numPr>
+          <w:ilvl w:val="0"/>
+          <w:numId w:val="12"/>
+        </w:numPr>
+        <w:rPr>
+          <w:highlight w:val="yellow"/>
+        </w:rPr>
+      </w:pPr>
+      <w:r>
+        <w:rPr>
+          <w:highlight w:val="yellow"/>
+        </w:rPr>
+        <w:t xml:space="preserve">Model should be able to give suggestions like if there is queu happening and what steps to do remove the queu, help decision’s manager’s decision making. </w:t>
+      </w:r>
+    </w:p>
+    <w:p>
+      <w:pPr>
+        <w:pStyle w:val="BodyText"/>
+        <w:numPr>
+          <w:ilvl w:val="0"/>
+          <w:numId w:val="12"/>
+        </w:numPr>
+        <w:rPr>
+          <w:highlight w:val="yellow"/>
+        </w:rPr>
+      </w:pPr>
+      <w:r>
+        <w:rPr>
+          <w:highlight w:val="yellow"/>
+        </w:rPr>
+        <w:t>Suggestions to reduce the queu</w:t>
+      </w:r>
+    </w:p>
+    <w:p>
+      <w:pPr>
+        <w:pStyle w:val="BodyText"/>
+        <w:numPr>
+          <w:ilvl w:val="0"/>
+          <w:numId w:val="12"/>
+        </w:numPr>
+      </w:pPr>
     </w:p>
     <w:sectPr>
       <w:pgSz w:w="12240" w:h="15840"/>
@@ -2073,6 +2158,118 @@
     </w:lvl>
   </w:abstractNum>
   <w:abstractNum w:abstractNumId="1" w15:restartNumberingAfterBreak="0">
+    <w:nsid w:val="1F9430E7"/>
+    <w:multiLevelType w:val="hybridMultilevel"/>
+    <w:tmpl w:val="3528CE6C"/>
+    <w:lvl w:ilvl="0" w:tplc="45B48B66">
+      <w:numFmt w:val="bullet"/>
+      <w:lvlText w:val="-"/>
+      <w:lvlJc w:val="left"/>
+      <w:pPr>
+        <w:ind w:left="720" w:hanging="360"/>
+      </w:pPr>
+      <w:rPr>
+        <w:rFonts w:ascii="Cambria" w:eastAsiaTheme="minorHAnsi" w:hAnsi="Cambria" w:cstheme="minorBidi" w:hint="default"/>
+      </w:rPr>
+    </w:lvl>
+    <w:lvl w:ilvl="1" w:tplc="04090003" w:tentative="1">
+      <w:start w:val="1"/>
+      <w:numFmt w:val="bullet"/>
+      <w:lvlText w:val="o"/>
+      <w:lvlJc w:val="left"/>
+      <w:pPr>
+        <w:ind w:left="1440" w:hanging="360"/>
+      </w:pPr>
+      <w:rPr>
+        <w:rFonts w:ascii="Courier New" w:hAnsi="Courier New" w:cs="Courier New" w:hint="default"/>
+      </w:rPr>
+    </w:lvl>
+    <w:lvl w:ilvl="2" w:tplc="04090005" w:tentative="1">
+      <w:start w:val="1"/>
+      <w:numFmt w:val="bullet"/>
+      <w:lvlText w:val=""/>
+      <w:lvlJc w:val="left"/>
+      <w:pPr>
+        <w:ind w:left="2160" w:hanging="360"/>
+      </w:pPr>
+      <w:rPr>
+        <w:rFonts w:ascii="Wingdings" w:hAnsi="Wingdings" w:hint="default"/>
+      </w:rPr>
+    </w:lvl>
+    <w:lvl w:ilvl="3" w:tplc="04090001" w:tentative="1">
+      <w:start w:val="1"/>
+      <w:numFmt w:val="bullet"/>
+      <w:lvlText w:val=""/>
+      <w:lvlJc w:val="left"/>
+      <w:pPr>
+        <w:ind w:left="2880" w:hanging="360"/>
+      </w:pPr>
+      <w:rPr>
+        <w:rFonts w:ascii="Symbol" w:hAnsi="Symbol" w:hint="default"/>
+      </w:rPr>
+    </w:lvl>
+    <w:lvl w:ilvl="4" w:tplc="04090003" w:tentative="1">
+      <w:start w:val="1"/>
+      <w:numFmt w:val="bullet"/>
+      <w:lvlText w:val="o"/>
+      <w:lvlJc w:val="left"/>
+      <w:pPr>
+        <w:ind w:left="3600" w:hanging="360"/>
+      </w:pPr>
+      <w:rPr>
+        <w:rFonts w:ascii="Courier New" w:hAnsi="Courier New" w:cs="Courier New" w:hint="default"/>
+      </w:rPr>
+    </w:lvl>
+    <w:lvl w:ilvl="5" w:tplc="04090005" w:tentative="1">
+      <w:start w:val="1"/>
+      <w:numFmt w:val="bullet"/>
+      <w:lvlText w:val=""/>
+      <w:lvlJc w:val="left"/>
+      <w:pPr>
+        <w:ind w:left="4320" w:hanging="360"/>
+      </w:pPr>
+      <w:rPr>
+        <w:rFonts w:ascii="Wingdings" w:hAnsi="Wingdings" w:hint="default"/>
+      </w:rPr>
+    </w:lvl>
+    <w:lvl w:ilvl="6" w:tplc="04090001" w:tentative="1">
+      <w:start w:val="1"/>
+      <w:numFmt w:val="bullet"/>
+      <w:lvlText w:val=""/>
+      <w:lvlJc w:val="left"/>
+      <w:pPr>
+        <w:ind w:left="5040" w:hanging="360"/>
+      </w:pPr>
+      <w:rPr>
+        <w:rFonts w:ascii="Symbol" w:hAnsi="Symbol" w:hint="default"/>
+      </w:rPr>
+    </w:lvl>
+    <w:lvl w:ilvl="7" w:tplc="04090003" w:tentative="1">
+      <w:start w:val="1"/>
+      <w:numFmt w:val="bullet"/>
+      <w:lvlText w:val="o"/>
+      <w:lvlJc w:val="left"/>
+      <w:pPr>
+        <w:ind w:left="5760" w:hanging="360"/>
+      </w:pPr>
+      <w:rPr>
+        <w:rFonts w:ascii="Courier New" w:hAnsi="Courier New" w:cs="Courier New" w:hint="default"/>
+      </w:rPr>
+    </w:lvl>
+    <w:lvl w:ilvl="8" w:tplc="04090005" w:tentative="1">
+      <w:start w:val="1"/>
+      <w:numFmt w:val="bullet"/>
+      <w:lvlText w:val=""/>
+      <w:lvlJc w:val="left"/>
+      <w:pPr>
+        <w:ind w:left="6480" w:hanging="360"/>
+      </w:pPr>
+      <w:rPr>
+        <w:rFonts w:ascii="Wingdings" w:hAnsi="Wingdings" w:hint="default"/>
+      </w:rPr>
+    </w:lvl>
+  </w:abstractNum>
+  <w:abstractNum w:abstractNumId="2" w15:restartNumberingAfterBreak="0">
     <w:nsid w:val="2C1AE401"/>
     <w:multiLevelType w:val="multilevel"/>
     <w:tmpl w:val="8676D1E6"/>
@@ -2149,7 +2346,7 @@
       </w:pPr>
     </w:lvl>
   </w:abstractNum>
-  <w:abstractNum w:abstractNumId="2" w15:restartNumberingAfterBreak="0">
+  <w:abstractNum w:abstractNumId="3" w15:restartNumberingAfterBreak="0">
     <w:nsid w:val="71315DCA"/>
     <w:multiLevelType w:val="multilevel"/>
     <w:tmpl w:val="B6242476"/>
@@ -2236,13 +2433,13 @@
     </w:lvl>
   </w:abstractNum>
   <w:num w:numId="1" w16cid:durableId="771439044">
-    <w:abstractNumId w:val="1"/>
+    <w:abstractNumId w:val="2"/>
   </w:num>
   <w:num w:numId="2" w16cid:durableId="1307587587">
     <w:abstractNumId w:val="0"/>
   </w:num>
   <w:num w:numId="3" w16cid:durableId="300770447">
-    <w:abstractNumId w:val="2"/>
+    <w:abstractNumId w:val="3"/>
     <w:lvlOverride w:ilvl="0">
       <w:startOverride w:val="1"/>
     </w:lvlOverride>
@@ -2294,6 +2491,9 @@
   </w:num>
   <w:num w:numId="11" w16cid:durableId="1224831101">
     <w:abstractNumId w:val="0"/>
+  </w:num>
+  <w:num w:numId="12" w16cid:durableId="1906330883">
+    <w:abstractNumId w:val="1"/>
   </w:num>
 </w:numbering>
 </file>
@@ -3380,6 +3580,18 @@
         </w:tcBorders>
       </w:tcPr>
     </w:tblStylePr>
+  </w:style>
+  <w:style w:type="character" w:styleId="UnresolvedMention">
+    <w:name w:val="Unresolved Mention"/>
+    <w:basedOn w:val="DefaultParagraphFont"/>
+    <w:uiPriority w:val="99"/>
+    <w:semiHidden/>
+    <w:unhideWhenUsed/>
+    <w:rsid w:val="00707284"/>
+    <w:rPr>
+      <w:color w:val="605E5C"/>
+      <w:shd w:val="clear" w:color="auto" w:fill="E1DFDD"/>
+    </w:rPr>
   </w:style>
 </w:styles>
 </file>

</xml_diff>